<commit_message>
Adición de aportaciones y evidencia de diseño de componenetes de software
</commit_message>
<xml_diff>
--- a/Evidencias y Aportaciones de los Avances/Notas de Usabilidad.docx
+++ b/Evidencias y Aportaciones de los Avances/Notas de Usabilidad.docx
@@ -81,21 +81,7 @@
         <w:rPr>
           <w:rFonts w:ascii="Times New Roman" w:hAnsi="Times New Roman" w:cs="Times New Roman"/>
         </w:rPr>
-        <w:t xml:space="preserve">Nombre: Jorge Manuel </w:t>
-      </w:r>
-      <w:proofErr w:type="spellStart"/>
-      <w:r>
-        <w:rPr>
-          <w:rFonts w:ascii="Times New Roman" w:hAnsi="Times New Roman" w:cs="Times New Roman"/>
-        </w:rPr>
-        <w:t>Oyoqui</w:t>
-      </w:r>
-      <w:proofErr w:type="spellEnd"/>
-      <w:r>
-        <w:rPr>
-          <w:rFonts w:ascii="Times New Roman" w:hAnsi="Times New Roman" w:cs="Times New Roman"/>
-        </w:rPr>
-        <w:t xml:space="preserve"> Aguilera</w:t>
+        <w:t>Nombre: Jorge Manuel Oyoqui Aguilera</w:t>
       </w:r>
     </w:p>
     <w:p>
@@ -255,7 +241,7 @@
           </mc:Choice>
           <mc:Fallback>
             <w:pict>
-              <v:line w14:anchorId="55E85E7E" id="Conector recto 1" o:spid="_x0000_s1026" style="position:absolute;z-index:251659264;visibility:visible;mso-wrap-style:square;mso-wrap-distance-left:9pt;mso-wrap-distance-top:0;mso-wrap-distance-right:9pt;mso-wrap-distance-bottom:0;mso-position-horizontal:center;mso-position-horizontal-relative:margin;mso-position-vertical:absolute;mso-position-vertical-relative:text" from="0,8.6pt" to="531pt,8.6pt" o:gfxdata="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" strokecolor="black [3200]">
+              <v:line w14:anchorId="66D45482" id="Conector recto 1" o:spid="_x0000_s1026" style="position:absolute;z-index:251659264;visibility:visible;mso-wrap-style:square;mso-wrap-distance-left:9pt;mso-wrap-distance-top:0;mso-wrap-distance-right:9pt;mso-wrap-distance-bottom:0;mso-position-horizontal:center;mso-position-horizontal-relative:margin;mso-position-vertical:absolute;mso-position-vertical-relative:text" from="0,8.6pt" to="531pt,8.6pt" o:gfxdata="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" strokecolor="black [3200]">
                 <v:stroke dashstyle="dash"/>
                 <w10:wrap anchorx="margin"/>
               </v:line>
@@ -274,6 +260,7 @@
     </w:p>
     <w:p>
       <w:pPr>
+        <w:spacing w:after="0"/>
         <w:jc w:val="center"/>
         <w:rPr>
           <w:rFonts w:ascii="Times New Roman" w:hAnsi="Times New Roman" w:cs="Times New Roman"/>
@@ -291,153 +278,165 @@
           <w:sz w:val="32"/>
           <w:szCs w:val="32"/>
         </w:rPr>
-        <w:t>Notas de Usabilidad</w:t>
-      </w:r>
-    </w:p>
-    <w:p>
-      <w:r>
-        <w:rPr>
-          <w:noProof/>
-        </w:rPr>
-        <w:drawing>
-          <wp:anchor distT="0" distB="0" distL="114300" distR="114300" simplePos="0" relativeHeight="251661312" behindDoc="1" locked="0" layoutInCell="1" allowOverlap="1" wp14:anchorId="493A53BB" wp14:editId="6A5688BA">
-            <wp:simplePos x="0" y="0"/>
-            <wp:positionH relativeFrom="margin">
-              <wp:align>center</wp:align>
-            </wp:positionH>
-            <wp:positionV relativeFrom="paragraph">
-              <wp:posOffset>46232</wp:posOffset>
-            </wp:positionV>
-            <wp:extent cx="5249920" cy="6120581"/>
-            <wp:effectExtent l="0" t="0" r="8255" b="0"/>
-            <wp:wrapNone/>
-            <wp:docPr id="1058159498" name="Imagen 1" descr="Texto&#10;&#10;El contenido generado por IA puede ser incorrecto."/>
-            <wp:cNvGraphicFramePr>
-              <a:graphicFrameLocks xmlns:a="http://schemas.openxmlformats.org/drawingml/2006/main" noChangeAspect="1"/>
-            </wp:cNvGraphicFramePr>
-            <a:graphic xmlns:a="http://schemas.openxmlformats.org/drawingml/2006/main">
-              <a:graphicData uri="http://schemas.openxmlformats.org/drawingml/2006/picture">
-                <pic:pic xmlns:pic="http://schemas.openxmlformats.org/drawingml/2006/picture">
-                  <pic:nvPicPr>
-                    <pic:cNvPr id="1058159498" name="Imagen 1" descr="Texto&#10;&#10;El contenido generado por IA puede ser incorrecto."/>
-                    <pic:cNvPicPr>
-                      <a:picLocks noChangeAspect="1" noChangeArrowheads="1"/>
-                    </pic:cNvPicPr>
-                  </pic:nvPicPr>
-                  <pic:blipFill rotWithShape="1">
-                    <a:blip r:embed="rId5">
-                      <a:extLst>
-                        <a:ext uri="{28A0092B-C50C-407E-A947-70E740481C1C}">
-                          <a14:useLocalDpi xmlns:a14="http://schemas.microsoft.com/office/drawing/2010/main" val="0"/>
-                        </a:ext>
-                      </a:extLst>
-                    </a:blip>
-                    <a:srcRect t="7370" b="5183"/>
-                    <a:stretch/>
-                  </pic:blipFill>
-                  <pic:spPr bwMode="auto">
-                    <a:xfrm>
-                      <a:off x="0" y="0"/>
-                      <a:ext cx="5249920" cy="6120581"/>
-                    </a:xfrm>
-                    <a:prstGeom prst="rect">
-                      <a:avLst/>
-                    </a:prstGeom>
-                    <a:noFill/>
-                    <a:ln>
-                      <a:noFill/>
-                    </a:ln>
-                    <a:extLst>
-                      <a:ext uri="{53640926-AAD7-44D8-BBD7-CCE9431645EC}">
-                        <a14:shadowObscured xmlns:a14="http://schemas.microsoft.com/office/drawing/2010/main"/>
-                      </a:ext>
-                    </a:extLst>
-                  </pic:spPr>
-                </pic:pic>
-              </a:graphicData>
-            </a:graphic>
-            <wp14:sizeRelH relativeFrom="margin">
-              <wp14:pctWidth>0</wp14:pctWidth>
-            </wp14:sizeRelH>
-            <wp14:sizeRelV relativeFrom="margin">
-              <wp14:pctHeight>0</wp14:pctHeight>
-            </wp14:sizeRelV>
-          </wp:anchor>
-        </w:drawing>
-      </w:r>
-    </w:p>
-    <w:p/>
-    <w:p/>
-    <w:p/>
-    <w:p/>
-    <w:p/>
-    <w:p/>
-    <w:p/>
-    <w:p/>
-    <w:p/>
-    <w:p/>
-    <w:p/>
-    <w:p/>
-    <w:p/>
-    <w:p/>
-    <w:p/>
-    <w:p/>
-    <w:p/>
-    <w:p/>
-    <w:p>
-      <w:r>
-        <w:rPr>
-          <w:noProof/>
-        </w:rPr>
-        <w:lastRenderedPageBreak/>
-        <w:drawing>
-          <wp:inline distT="0" distB="0" distL="0" distR="0" wp14:anchorId="53515D33" wp14:editId="2C31EE23">
-            <wp:extent cx="5612130" cy="7480300"/>
-            <wp:effectExtent l="0" t="0" r="7620" b="6350"/>
-            <wp:docPr id="1531534813" name="Imagen 2" descr="Texto&#10;&#10;El contenido generado por IA puede ser incorrecto."/>
-            <wp:cNvGraphicFramePr>
-              <a:graphicFrameLocks xmlns:a="http://schemas.openxmlformats.org/drawingml/2006/main" noChangeAspect="1"/>
-            </wp:cNvGraphicFramePr>
-            <a:graphic xmlns:a="http://schemas.openxmlformats.org/drawingml/2006/main">
-              <a:graphicData uri="http://schemas.openxmlformats.org/drawingml/2006/picture">
-                <pic:pic xmlns:pic="http://schemas.openxmlformats.org/drawingml/2006/picture">
-                  <pic:nvPicPr>
-                    <pic:cNvPr id="1531534813" name="Imagen 2" descr="Texto&#10;&#10;El contenido generado por IA puede ser incorrecto."/>
-                    <pic:cNvPicPr>
-                      <a:picLocks noChangeAspect="1" noChangeArrowheads="1"/>
-                    </pic:cNvPicPr>
-                  </pic:nvPicPr>
-                  <pic:blipFill>
-                    <a:blip r:embed="rId6">
-                      <a:extLst>
-                        <a:ext uri="{28A0092B-C50C-407E-A947-70E740481C1C}">
-                          <a14:useLocalDpi xmlns:a14="http://schemas.microsoft.com/office/drawing/2010/main" val="0"/>
-                        </a:ext>
-                      </a:extLst>
-                    </a:blip>
-                    <a:srcRect/>
-                    <a:stretch>
-                      <a:fillRect/>
-                    </a:stretch>
-                  </pic:blipFill>
-                  <pic:spPr bwMode="auto">
-                    <a:xfrm>
-                      <a:off x="0" y="0"/>
-                      <a:ext cx="5612130" cy="7480300"/>
-                    </a:xfrm>
-                    <a:prstGeom prst="rect">
-                      <a:avLst/>
-                    </a:prstGeom>
-                    <a:noFill/>
-                    <a:ln>
-                      <a:noFill/>
-                    </a:ln>
-                  </pic:spPr>
-                </pic:pic>
-              </a:graphicData>
-            </a:graphic>
-          </wp:inline>
-        </w:drawing>
+        <w:t>Evidencia</w:t>
+      </w:r>
+      <w:r>
+        <w:rPr>
+          <w:rFonts w:ascii="Times New Roman" w:hAnsi="Times New Roman" w:cs="Times New Roman"/>
+          <w:b/>
+          <w:bCs/>
+          <w:sz w:val="32"/>
+          <w:szCs w:val="32"/>
+        </w:rPr>
+        <w:t xml:space="preserve"> y aportaciones</w:t>
+      </w:r>
+      <w:r>
+        <w:rPr>
+          <w:rFonts w:ascii="Times New Roman" w:hAnsi="Times New Roman" w:cs="Times New Roman"/>
+          <w:b/>
+          <w:bCs/>
+          <w:sz w:val="32"/>
+          <w:szCs w:val="32"/>
+        </w:rPr>
+        <w:t xml:space="preserve"> de Diseño de Componentes de Software</w:t>
+      </w:r>
+    </w:p>
+    <w:p>
+      <w:pPr>
+        <w:rPr>
+          <w:rFonts w:ascii="Times New Roman" w:hAnsi="Times New Roman" w:cs="Times New Roman"/>
+          <w:sz w:val="24"/>
+          <w:szCs w:val="24"/>
+        </w:rPr>
+      </w:pPr>
+    </w:p>
+    <w:p>
+      <w:pPr>
+        <w:jc w:val="both"/>
+        <w:rPr>
+          <w:rFonts w:ascii="Times New Roman" w:hAnsi="Times New Roman" w:cs="Times New Roman"/>
+          <w:sz w:val="24"/>
+          <w:szCs w:val="24"/>
+        </w:rPr>
+      </w:pPr>
+      <w:r>
+        <w:rPr>
+          <w:rFonts w:ascii="Times New Roman" w:hAnsi="Times New Roman" w:cs="Times New Roman"/>
+          <w:sz w:val="24"/>
+          <w:szCs w:val="24"/>
+        </w:rPr>
+        <w:t xml:space="preserve">Mis aportaciones para esta evidencia en específico fue que ayude a crear </w:t>
+      </w:r>
+      <w:r>
+        <w:rPr>
+          <w:rFonts w:ascii="Times New Roman" w:hAnsi="Times New Roman" w:cs="Times New Roman"/>
+          <w:sz w:val="24"/>
+          <w:szCs w:val="24"/>
+        </w:rPr>
+        <w:t xml:space="preserve">una gran cantidad de diagramas de secuencia para varios de los casos de uso que definimos en nuestro proyecto. Específicamente, ayudé con los </w:t>
+      </w:r>
+      <w:r>
+        <w:rPr>
+          <w:rFonts w:ascii="Times New Roman" w:hAnsi="Times New Roman" w:cs="Times New Roman"/>
+          <w:sz w:val="24"/>
+          <w:szCs w:val="24"/>
+        </w:rPr>
+        <w:t xml:space="preserve">diagramas de secuencia de los casos de prueba 1 </w:t>
+      </w:r>
+      <w:r>
+        <w:rPr>
+          <w:rFonts w:ascii="Times New Roman" w:hAnsi="Times New Roman" w:cs="Times New Roman"/>
+          <w:sz w:val="24"/>
+          <w:szCs w:val="24"/>
+        </w:rPr>
+        <w:t>y del 3-11, ya fuera que los creara yo o que ayudara con su corrección.</w:t>
+      </w:r>
+    </w:p>
+    <w:p>
+      <w:pPr>
+        <w:jc w:val="both"/>
+        <w:rPr>
+          <w:rFonts w:ascii="Times New Roman" w:hAnsi="Times New Roman" w:cs="Times New Roman"/>
+          <w:sz w:val="24"/>
+          <w:szCs w:val="24"/>
+        </w:rPr>
+      </w:pPr>
+      <w:r>
+        <w:rPr>
+          <w:rFonts w:ascii="Times New Roman" w:hAnsi="Times New Roman" w:cs="Times New Roman"/>
+          <w:sz w:val="24"/>
+          <w:szCs w:val="24"/>
+        </w:rPr>
+        <w:t xml:space="preserve">Los diagramas de secuencia se pueden encontrar en el documento </w:t>
+      </w:r>
+      <w:r>
+        <w:rPr>
+          <w:rFonts w:ascii="Times New Roman" w:hAnsi="Times New Roman" w:cs="Times New Roman"/>
+          <w:sz w:val="24"/>
+          <w:szCs w:val="24"/>
+        </w:rPr>
+        <w:t xml:space="preserve">De nuestro proyecto llamado Cuenta Fácil (Link al docs: </w:t>
+      </w:r>
+      <w:hyperlink r:id="rId5" w:history="1">
+        <w:r>
+          <w:rPr>
+            <w:rStyle w:val="Hipervnculo"/>
+            <w:rFonts w:ascii="Times New Roman" w:hAnsi="Times New Roman" w:cs="Times New Roman"/>
+            <w:sz w:val="24"/>
+            <w:szCs w:val="24"/>
+          </w:rPr>
+          <w:t>https://docs.google.com/document/d/1JJeY7MTlAZpI7SI1TiLWRo9ZZ5FcWtOKJWtavTFlFWI/edit?tab=t.0#heading=h.jivtqlp0vy2t</w:t>
+        </w:r>
+      </w:hyperlink>
+      <w:r>
+        <w:rPr>
+          <w:rFonts w:ascii="Times New Roman" w:hAnsi="Times New Roman" w:cs="Times New Roman"/>
+          <w:sz w:val="24"/>
+          <w:szCs w:val="24"/>
+        </w:rPr>
+        <w:t>)</w:t>
+      </w:r>
+      <w:r>
+        <w:rPr>
+          <w:rFonts w:ascii="Times New Roman" w:hAnsi="Times New Roman" w:cs="Times New Roman"/>
+          <w:sz w:val="24"/>
+          <w:szCs w:val="24"/>
+        </w:rPr>
+        <w:t xml:space="preserve"> en las páginas de la </w:t>
+      </w:r>
+      <w:r>
+        <w:rPr>
+          <w:rFonts w:ascii="Times New Roman" w:hAnsi="Times New Roman" w:cs="Times New Roman"/>
+          <w:sz w:val="24"/>
+          <w:szCs w:val="24"/>
+        </w:rPr>
+        <w:t>27 a la 64 (pues los diagramas de secuencia se encuentran entre los demás datos de los casos de uso</w:t>
+      </w:r>
+      <w:r>
+        <w:rPr>
+          <w:rFonts w:ascii="Times New Roman" w:hAnsi="Times New Roman" w:cs="Times New Roman"/>
+          <w:sz w:val="24"/>
+          <w:szCs w:val="24"/>
+        </w:rPr>
+        <w:t xml:space="preserve"> como su descripción o tablas de escenarios).</w:t>
+      </w:r>
+    </w:p>
+    <w:p>
+      <w:pPr>
+        <w:jc w:val="both"/>
+        <w:rPr>
+          <w:rFonts w:ascii="Times New Roman" w:hAnsi="Times New Roman" w:cs="Times New Roman"/>
+          <w:sz w:val="24"/>
+          <w:szCs w:val="24"/>
+        </w:rPr>
+      </w:pPr>
+      <w:r>
+        <w:rPr>
+          <w:rFonts w:ascii="Times New Roman" w:hAnsi="Times New Roman" w:cs="Times New Roman"/>
+          <w:sz w:val="24"/>
+          <w:szCs w:val="24"/>
+        </w:rPr>
+        <w:t xml:space="preserve"> </w:t>
       </w:r>
     </w:p>
     <w:sectPr>
@@ -894,6 +893,29 @@
     <w:semiHidden/>
     <w:unhideWhenUsed/>
   </w:style>
+  <w:style w:type="character" w:styleId="Hipervnculo">
+    <w:name w:val="Hyperlink"/>
+    <w:basedOn w:val="Fuentedeprrafopredeter"/>
+    <w:uiPriority w:val="99"/>
+    <w:unhideWhenUsed/>
+    <w:rsid w:val="00FF637D"/>
+    <w:rPr>
+      <w:color w:val="0563C1" w:themeColor="hyperlink"/>
+      <w:u w:val="single"/>
+    </w:rPr>
+  </w:style>
+  <w:style w:type="character" w:styleId="Mencinsinresolver">
+    <w:name w:val="Unresolved Mention"/>
+    <w:basedOn w:val="Fuentedeprrafopredeter"/>
+    <w:uiPriority w:val="99"/>
+    <w:semiHidden/>
+    <w:unhideWhenUsed/>
+    <w:rsid w:val="00FF637D"/>
+    <w:rPr>
+      <w:color w:val="605E5C"/>
+      <w:shd w:val="clear" w:color="auto" w:fill="E1DFDD"/>
+    </w:rPr>
+  </w:style>
 </w:styles>
 </file>
 

</xml_diff>